<commit_message>
add repo and wbsite link
</commit_message>
<xml_diff>
--- a/Final-Term Project-DevOps-Fall2024.docx
+++ b/Final-Term Project-DevOps-Fall2024.docx
@@ -1,6 +1,6 @@
 
 <file path=word/document.xml><?xml version="1.0" encoding="utf-8"?>
-<w:document xmlns:wpc="http://schemas.microsoft.com/office/word/2010/wordprocessingCanvas" xmlns:cx="http://schemas.microsoft.com/office/drawing/2014/chartex" xmlns:cx1="http://schemas.microsoft.com/office/drawing/2015/9/8/chartex" xmlns:cx2="http://schemas.microsoft.com/office/drawing/2015/10/21/chartex" xmlns:cx3="http://schemas.microsoft.com/office/drawing/2016/5/9/chartex" xmlns:cx4="http://schemas.microsoft.com/office/drawing/2016/5/10/chartex" xmlns:cx5="http://schemas.microsoft.com/office/drawing/2016/5/11/chartex" xmlns:cx6="http://schemas.microsoft.com/office/drawing/2016/5/12/chartex" xmlns:cx7="http://schemas.microsoft.com/office/drawing/2016/5/13/chartex" xmlns:cx8="http://schemas.microsoft.com/office/drawing/2016/5/14/chartex" xmlns:mc="http://schemas.openxmlformats.org/markup-compatibility/2006" xmlns:aink="http://schemas.microsoft.com/office/drawing/2016/ink" xmlns:am3d="http://schemas.microsoft.com/office/drawing/2017/model3d" xmlns:o="urn:schemas-microsoft-com:office:office" xmlns:oel="http://schemas.microsoft.com/office/2019/extlst" xmlns:r="http://schemas.openxmlformats.org/officeDocument/2006/relationships" xmlns:m="http://schemas.openxmlformats.org/officeDocument/2006/math" xmlns:v="urn:schemas-microsoft-com:vml" xmlns:wp14="http://schemas.microsoft.com/office/word/2010/wordprocessingDrawing" xmlns:wp="http://schemas.openxmlformats.org/drawingml/2006/wordprocessingDrawing" xmlns:w10="urn:schemas-microsoft-com:office:word" xmlns:w="http://schemas.openxmlformats.org/wordprocessingml/2006/main" xmlns:w14="http://schemas.microsoft.com/office/word/2010/wordml" xmlns:w15="http://schemas.microsoft.com/office/word/2012/wordml" xmlns:w16cex="http://schemas.microsoft.com/office/word/2018/wordml/cex" xmlns:w16cid="http://schemas.microsoft.com/office/word/2016/wordml/cid" xmlns:w16="http://schemas.microsoft.com/office/word/2018/wordml" xmlns:w16du="http://schemas.microsoft.com/office/word/2023/wordml/word16du" xmlns:w16sdtdh="http://schemas.microsoft.com/office/word/2020/wordml/sdtdatahash" xmlns:w16sdtfl="http://schemas.microsoft.com/office/word/2024/wordml/sdtformatlock" xmlns:w16se="http://schemas.microsoft.com/office/word/2015/wordml/symex" xmlns:wpg="http://schemas.microsoft.com/office/word/2010/wordprocessingGroup" xmlns:wpi="http://schemas.microsoft.com/office/word/2010/wordprocessingInk" xmlns:wne="http://schemas.microsoft.com/office/word/2006/wordml" xmlns:wps="http://schemas.microsoft.com/office/word/2010/wordprocessingShape" mc:Ignorable="w14 w15 w16se w16cid w16 w16cex w16sdtdh w16sdtfl w16du wp14">
+<w:document xmlns:wpc="http://schemas.microsoft.com/office/word/2010/wordprocessingCanvas" xmlns:cx="http://schemas.microsoft.com/office/drawing/2014/chartex" xmlns:cx1="http://schemas.microsoft.com/office/drawing/2015/9/8/chartex" xmlns:cx2="http://schemas.microsoft.com/office/drawing/2015/10/21/chartex" xmlns:cx3="http://schemas.microsoft.com/office/drawing/2016/5/9/chartex" xmlns:cx4="http://schemas.microsoft.com/office/drawing/2016/5/10/chartex" xmlns:cx5="http://schemas.microsoft.com/office/drawing/2016/5/11/chartex" xmlns:cx6="http://schemas.microsoft.com/office/drawing/2016/5/12/chartex" xmlns:cx7="http://schemas.microsoft.com/office/drawing/2016/5/13/chartex" xmlns:cx8="http://schemas.microsoft.com/office/drawing/2016/5/14/chartex" xmlns:mc="http://schemas.openxmlformats.org/markup-compatibility/2006" xmlns:aink="http://schemas.microsoft.com/office/drawing/2016/ink" xmlns:am3d="http://schemas.microsoft.com/office/drawing/2017/model3d" xmlns:o="urn:schemas-microsoft-com:office:office" xmlns:r="http://schemas.openxmlformats.org/officeDocument/2006/relationships" xmlns:m="http://schemas.openxmlformats.org/officeDocument/2006/math" xmlns:v="urn:schemas-microsoft-com:vml" xmlns:wp14="http://schemas.microsoft.com/office/word/2010/wordprocessingDrawing" xmlns:wp="http://schemas.openxmlformats.org/drawingml/2006/wordprocessingDrawing" xmlns:w10="urn:schemas-microsoft-com:office:word" xmlns:w="http://schemas.openxmlformats.org/wordprocessingml/2006/main" xmlns:w14="http://schemas.microsoft.com/office/word/2010/wordml" xmlns:w15="http://schemas.microsoft.com/office/word/2012/wordml" xmlns:w16cex="http://schemas.microsoft.com/office/word/2018/wordml/cex" xmlns:w16cid="http://schemas.microsoft.com/office/word/2016/wordml/cid" xmlns:w16="http://schemas.microsoft.com/office/word/2018/wordml" xmlns:w16sdtdh="http://schemas.microsoft.com/office/word/2020/wordml/sdtdatahash" xmlns:w16se="http://schemas.microsoft.com/office/word/2015/wordml/symex" xmlns:wpg="http://schemas.microsoft.com/office/word/2010/wordprocessingGroup" xmlns:wpi="http://schemas.microsoft.com/office/word/2010/wordprocessingInk" xmlns:wne="http://schemas.microsoft.com/office/word/2006/wordml" xmlns:wps="http://schemas.microsoft.com/office/word/2010/wordprocessingShape" mc:Ignorable="w14 w15 w16se w16cid w16 w16cex w16sdtdh wp14">
   <w:body>
     <w:p>
       <w:pPr>
@@ -508,14 +508,27 @@
       <w:r>
         <w:t xml:space="preserve">Table </w:t>
       </w:r>
-      <w:fldSimple w:instr=" SEQ Table \* ARABIC ">
-        <w:r>
-          <w:rPr>
-            <w:noProof/>
-          </w:rPr>
-          <w:t>1</w:t>
-        </w:r>
-      </w:fldSimple>
+      <w:r>
+        <w:fldChar w:fldCharType="begin"/>
+      </w:r>
+      <w:r>
+        <w:instrText xml:space="preserve"> SEQ Table \* ARABIC </w:instrText>
+      </w:r>
+      <w:r>
+        <w:fldChar w:fldCharType="separate"/>
+      </w:r>
+      <w:r>
+        <w:rPr>
+          <w:noProof/>
+        </w:rPr>
+        <w:t>1</w:t>
+      </w:r>
+      <w:r>
+        <w:rPr>
+          <w:noProof/>
+        </w:rPr>
+        <w:fldChar w:fldCharType="end"/>
+      </w:r>
     </w:p>
     <w:tbl>
       <w:tblPr>
@@ -524,11 +537,11 @@
         <w:tblLook w:val="04A0" w:firstRow="1" w:lastRow="0" w:firstColumn="1" w:lastColumn="0" w:noHBand="0" w:noVBand="1"/>
       </w:tblPr>
       <w:tblGrid>
-        <w:gridCol w:w="612"/>
-        <w:gridCol w:w="2439"/>
-        <w:gridCol w:w="2467"/>
-        <w:gridCol w:w="1582"/>
-        <w:gridCol w:w="2345"/>
+        <w:gridCol w:w="470"/>
+        <w:gridCol w:w="1592"/>
+        <w:gridCol w:w="1909"/>
+        <w:gridCol w:w="1188"/>
+        <w:gridCol w:w="4286"/>
       </w:tblGrid>
       <w:tr>
         <w:trPr>
@@ -592,16 +605,7 @@
                 <w:b/>
                 <w:bCs/>
               </w:rPr>
-              <w:t>Website URL</w:t>
-            </w:r>
-            <w:proofErr w:type="gramStart"/>
-            <w:r>
-              <w:rPr>
-                <w:rFonts w:ascii="Calibri" w:hAnsi="Calibri" w:cs="Calibri"/>
-                <w:b/>
-                <w:bCs/>
-              </w:rPr>
-              <w:t xml:space="preserve">:  </w:t>
+              <w:t xml:space="preserve">Website URL:  </w:t>
             </w:r>
             <w:r>
               <w:rPr>
@@ -610,26 +614,7 @@
                 <w:bCs/>
                 <w:color w:val="FF0000"/>
               </w:rPr>
-              <w:t>[</w:t>
-            </w:r>
-            <w:proofErr w:type="gramEnd"/>
-            <w:r>
-              <w:rPr>
-                <w:rFonts w:ascii="Calibri" w:hAnsi="Calibri" w:cs="Calibri"/>
-                <w:b/>
-                <w:bCs/>
-                <w:color w:val="FF0000"/>
-              </w:rPr>
-              <w:t xml:space="preserve">Paste Your Website </w:t>
-            </w:r>
-            <w:r>
-              <w:rPr>
-                <w:rFonts w:ascii="Calibri" w:hAnsi="Calibri" w:cs="Calibri"/>
-                <w:b/>
-                <w:bCs/>
-                <w:color w:val="FF0000"/>
-              </w:rPr>
-              <w:t>URL Here]</w:t>
+              <w:t>https://saadmahmooood.github.io/term-project-f24/</w:t>
             </w:r>
           </w:p>
         </w:tc>
@@ -794,18 +779,8 @@
                 <w:b/>
                 <w:bCs/>
               </w:rPr>
-              <w:t xml:space="preserve"> worked </w:t>
-            </w:r>
-            <w:proofErr w:type="gramStart"/>
-            <w:r>
-              <w:rPr>
-                <w:rFonts w:ascii="Calibri" w:hAnsi="Calibri" w:cs="Calibri"/>
-                <w:b/>
-                <w:bCs/>
-              </w:rPr>
-              <w:t>On</w:t>
-            </w:r>
-            <w:proofErr w:type="gramEnd"/>
+              <w:t xml:space="preserve"> worked On</w:t>
+            </w:r>
           </w:p>
         </w:tc>
       </w:tr>
@@ -923,6 +898,12 @@
               </w:rPr>
               <w:t>/Home-Page</w:t>
             </w:r>
+            <w:r>
+              <w:rPr>
+                <w:rFonts w:ascii="Calibri" w:hAnsi="Calibri" w:cs="Calibri"/>
+              </w:rPr>
+              <w:t>/release/v1.0.0/production/bugfix/repo-link</w:t>
+            </w:r>
           </w:p>
         </w:tc>
       </w:tr>
@@ -1032,13 +1013,7 @@
               <w:rPr>
                 <w:rFonts w:ascii="Calibri" w:hAnsi="Calibri" w:cs="Calibri"/>
               </w:rPr>
-              <w:t>Develop/c</w:t>
-            </w:r>
-            <w:r>
-              <w:rPr>
-                <w:rFonts w:ascii="Calibri" w:hAnsi="Calibri" w:cs="Calibri"/>
-              </w:rPr>
-              <w:t>d</w:t>
+              <w:t>Develop/cd</w:t>
             </w:r>
             <w:r>
               <w:rPr>
@@ -1155,13 +1130,7 @@
               <w:rPr>
                 <w:rFonts w:ascii="Calibri" w:hAnsi="Calibri" w:cs="Calibri"/>
               </w:rPr>
-              <w:t>staging</w:t>
-            </w:r>
-            <w:r>
-              <w:rPr>
-                <w:rFonts w:ascii="Calibri" w:hAnsi="Calibri" w:cs="Calibri"/>
-              </w:rPr>
-              <w:t>/ci</w:t>
+              <w:t>staging/ci</w:t>
             </w:r>
             <w:r>
               <w:rPr>
@@ -1278,13 +1247,7 @@
               <w:rPr>
                 <w:rFonts w:ascii="Calibri" w:hAnsi="Calibri" w:cs="Calibri"/>
               </w:rPr>
-              <w:t>staging/c</w:t>
-            </w:r>
-            <w:r>
-              <w:rPr>
-                <w:rFonts w:ascii="Calibri" w:hAnsi="Calibri" w:cs="Calibri"/>
-              </w:rPr>
-              <w:t>d</w:t>
+              <w:t>staging/cd</w:t>
             </w:r>
             <w:r>
               <w:rPr>
@@ -1401,19 +1364,7 @@
               <w:rPr>
                 <w:rFonts w:ascii="Calibri" w:hAnsi="Calibri" w:cs="Calibri"/>
               </w:rPr>
-              <w:t>production</w:t>
-            </w:r>
-            <w:r>
-              <w:rPr>
-                <w:rFonts w:ascii="Calibri" w:hAnsi="Calibri" w:cs="Calibri"/>
-              </w:rPr>
-              <w:t>/ci</w:t>
-            </w:r>
-            <w:r>
-              <w:rPr>
-                <w:rFonts w:ascii="Calibri" w:hAnsi="Calibri" w:cs="Calibri"/>
-              </w:rPr>
-              <w:t>/Blog</w:t>
+              <w:t>production/ci/Blog</w:t>
             </w:r>
           </w:p>
         </w:tc>
@@ -1442,6 +1393,7 @@
                 <w:b/>
                 <w:bCs/>
               </w:rPr>
+              <w:lastRenderedPageBreak/>
               <w:t>6</w:t>
             </w:r>
           </w:p>
@@ -1524,19 +1476,7 @@
               <w:rPr>
                 <w:rFonts w:ascii="Calibri" w:hAnsi="Calibri" w:cs="Calibri"/>
               </w:rPr>
-              <w:t>production</w:t>
-            </w:r>
-            <w:r>
-              <w:rPr>
-                <w:rFonts w:ascii="Calibri" w:hAnsi="Calibri" w:cs="Calibri"/>
-              </w:rPr>
-              <w:t>/c</w:t>
-            </w:r>
-            <w:r>
-              <w:rPr>
-                <w:rFonts w:ascii="Calibri" w:hAnsi="Calibri" w:cs="Calibri"/>
-              </w:rPr>
-              <w:t>d/Contact-us</w:t>
+              <w:t>production/cd/Contact-us</w:t>
             </w:r>
           </w:p>
         </w:tc>
@@ -1570,7 +1510,6 @@
           <w:sz w:val="30"/>
           <w:szCs w:val="30"/>
         </w:rPr>
-        <w:lastRenderedPageBreak/>
         <w:t>Scenario</w:t>
       </w:r>
     </w:p>
@@ -2247,6 +2186,7 @@
           <w:sz w:val="24"/>
           <w:szCs w:val="24"/>
         </w:rPr>
+        <w:lastRenderedPageBreak/>
         <w:t>Final deployment and functionality</w:t>
       </w:r>
       <w:r>
@@ -2696,17 +2636,8 @@
           <w:sz w:val="24"/>
           <w:szCs w:val="24"/>
         </w:rPr>
-        <w:t xml:space="preserve"> for each </w:t>
-      </w:r>
-      <w:proofErr w:type="spellStart"/>
-      <w:r>
-        <w:rPr>
-          <w:sz w:val="24"/>
-          <w:szCs w:val="24"/>
-        </w:rPr>
-        <w:t>environemtn</w:t>
-      </w:r>
-      <w:proofErr w:type="spellEnd"/>
+        <w:t xml:space="preserve"> for each environemtn</w:t>
+      </w:r>
       <w:r>
         <w:rPr>
           <w:sz w:val="24"/>
@@ -2751,14 +2682,27 @@
       <w:r>
         <w:t xml:space="preserve">Table </w:t>
       </w:r>
-      <w:fldSimple w:instr=" SEQ Table \* ARABIC ">
-        <w:r>
-          <w:rPr>
-            <w:noProof/>
-          </w:rPr>
-          <w:t>2</w:t>
-        </w:r>
-      </w:fldSimple>
+      <w:r>
+        <w:fldChar w:fldCharType="begin"/>
+      </w:r>
+      <w:r>
+        <w:instrText xml:space="preserve"> SEQ Table \* ARABIC </w:instrText>
+      </w:r>
+      <w:r>
+        <w:fldChar w:fldCharType="separate"/>
+      </w:r>
+      <w:r>
+        <w:rPr>
+          <w:noProof/>
+        </w:rPr>
+        <w:t>2</w:t>
+      </w:r>
+      <w:r>
+        <w:rPr>
+          <w:noProof/>
+        </w:rPr>
+        <w:fldChar w:fldCharType="end"/>
+      </w:r>
     </w:p>
     <w:tbl>
       <w:tblPr>
@@ -3775,7 +3719,6 @@
         <w:br/>
         <w:t>5.2. Develop the HTML and CSS files for the assigned page, adhering to linting rules (</w:t>
       </w:r>
-      <w:proofErr w:type="spellStart"/>
       <w:r>
         <w:rPr>
           <w:b/>
@@ -3785,7 +3728,6 @@
         </w:rPr>
         <w:t>HTMLHint</w:t>
       </w:r>
-      <w:proofErr w:type="spellEnd"/>
       <w:r>
         <w:rPr>
           <w:sz w:val="24"/>
@@ -3793,7 +3735,6 @@
         </w:rPr>
         <w:t xml:space="preserve"> and </w:t>
       </w:r>
-      <w:proofErr w:type="spellStart"/>
       <w:r>
         <w:rPr>
           <w:b/>
@@ -3803,7 +3744,6 @@
         </w:rPr>
         <w:t>Stylelint</w:t>
       </w:r>
-      <w:proofErr w:type="spellEnd"/>
       <w:r>
         <w:rPr>
           <w:sz w:val="24"/>
@@ -3956,6 +3896,7 @@
           <w:sz w:val="24"/>
           <w:szCs w:val="24"/>
         </w:rPr>
+        <w:lastRenderedPageBreak/>
         <w:t xml:space="preserve">6.1. Create a </w:t>
       </w:r>
       <w:r>
@@ -4003,7 +3944,7 @@
 </file>
 
 <file path=word/endnotes.xml><?xml version="1.0" encoding="utf-8"?>
-<w:endnotes xmlns:wpc="http://schemas.microsoft.com/office/word/2010/wordprocessingCanvas" xmlns:cx="http://schemas.microsoft.com/office/drawing/2014/chartex" xmlns:cx1="http://schemas.microsoft.com/office/drawing/2015/9/8/chartex" xmlns:cx2="http://schemas.microsoft.com/office/drawing/2015/10/21/chartex" xmlns:cx3="http://schemas.microsoft.com/office/drawing/2016/5/9/chartex" xmlns:cx4="http://schemas.microsoft.com/office/drawing/2016/5/10/chartex" xmlns:cx5="http://schemas.microsoft.com/office/drawing/2016/5/11/chartex" xmlns:cx6="http://schemas.microsoft.com/office/drawing/2016/5/12/chartex" xmlns:cx7="http://schemas.microsoft.com/office/drawing/2016/5/13/chartex" xmlns:cx8="http://schemas.microsoft.com/office/drawing/2016/5/14/chartex" xmlns:mc="http://schemas.openxmlformats.org/markup-compatibility/2006" xmlns:aink="http://schemas.microsoft.com/office/drawing/2016/ink" xmlns:am3d="http://schemas.microsoft.com/office/drawing/2017/model3d" xmlns:o="urn:schemas-microsoft-com:office:office" xmlns:oel="http://schemas.microsoft.com/office/2019/extlst" xmlns:r="http://schemas.openxmlformats.org/officeDocument/2006/relationships" xmlns:m="http://schemas.openxmlformats.org/officeDocument/2006/math" xmlns:v="urn:schemas-microsoft-com:vml" xmlns:wp14="http://schemas.microsoft.com/office/word/2010/wordprocessingDrawing" xmlns:wp="http://schemas.openxmlformats.org/drawingml/2006/wordprocessingDrawing" xmlns:w10="urn:schemas-microsoft-com:office:word" xmlns:w="http://schemas.openxmlformats.org/wordprocessingml/2006/main" xmlns:w14="http://schemas.microsoft.com/office/word/2010/wordml" xmlns:w15="http://schemas.microsoft.com/office/word/2012/wordml" xmlns:w16cex="http://schemas.microsoft.com/office/word/2018/wordml/cex" xmlns:w16cid="http://schemas.microsoft.com/office/word/2016/wordml/cid" xmlns:w16="http://schemas.microsoft.com/office/word/2018/wordml" xmlns:w16du="http://schemas.microsoft.com/office/word/2023/wordml/word16du" xmlns:w16sdtdh="http://schemas.microsoft.com/office/word/2020/wordml/sdtdatahash" xmlns:w16sdtfl="http://schemas.microsoft.com/office/word/2024/wordml/sdtformatlock" xmlns:w16se="http://schemas.microsoft.com/office/word/2015/wordml/symex" xmlns:wpg="http://schemas.microsoft.com/office/word/2010/wordprocessingGroup" xmlns:wpi="http://schemas.microsoft.com/office/word/2010/wordprocessingInk" xmlns:wne="http://schemas.microsoft.com/office/word/2006/wordml" xmlns:wps="http://schemas.microsoft.com/office/word/2010/wordprocessingShape" mc:Ignorable="w14 w15 w16se w16cid w16 w16cex w16sdtdh w16sdtfl w16du wp14">
+<w:endnotes xmlns:wpc="http://schemas.microsoft.com/office/word/2010/wordprocessingCanvas" xmlns:cx="http://schemas.microsoft.com/office/drawing/2014/chartex" xmlns:cx1="http://schemas.microsoft.com/office/drawing/2015/9/8/chartex" xmlns:cx2="http://schemas.microsoft.com/office/drawing/2015/10/21/chartex" xmlns:cx3="http://schemas.microsoft.com/office/drawing/2016/5/9/chartex" xmlns:cx4="http://schemas.microsoft.com/office/drawing/2016/5/10/chartex" xmlns:cx5="http://schemas.microsoft.com/office/drawing/2016/5/11/chartex" xmlns:cx6="http://schemas.microsoft.com/office/drawing/2016/5/12/chartex" xmlns:cx7="http://schemas.microsoft.com/office/drawing/2016/5/13/chartex" xmlns:cx8="http://schemas.microsoft.com/office/drawing/2016/5/14/chartex" xmlns:mc="http://schemas.openxmlformats.org/markup-compatibility/2006" xmlns:aink="http://schemas.microsoft.com/office/drawing/2016/ink" xmlns:am3d="http://schemas.microsoft.com/office/drawing/2017/model3d" xmlns:o="urn:schemas-microsoft-com:office:office" xmlns:r="http://schemas.openxmlformats.org/officeDocument/2006/relationships" xmlns:m="http://schemas.openxmlformats.org/officeDocument/2006/math" xmlns:v="urn:schemas-microsoft-com:vml" xmlns:wp14="http://schemas.microsoft.com/office/word/2010/wordprocessingDrawing" xmlns:wp="http://schemas.openxmlformats.org/drawingml/2006/wordprocessingDrawing" xmlns:w10="urn:schemas-microsoft-com:office:word" xmlns:w="http://schemas.openxmlformats.org/wordprocessingml/2006/main" xmlns:w14="http://schemas.microsoft.com/office/word/2010/wordml" xmlns:w15="http://schemas.microsoft.com/office/word/2012/wordml" xmlns:w16cex="http://schemas.microsoft.com/office/word/2018/wordml/cex" xmlns:w16cid="http://schemas.microsoft.com/office/word/2016/wordml/cid" xmlns:w16="http://schemas.microsoft.com/office/word/2018/wordml" xmlns:w16sdtdh="http://schemas.microsoft.com/office/word/2020/wordml/sdtdatahash" xmlns:w16se="http://schemas.microsoft.com/office/word/2015/wordml/symex" xmlns:wpg="http://schemas.microsoft.com/office/word/2010/wordprocessingGroup" xmlns:wpi="http://schemas.microsoft.com/office/word/2010/wordprocessingInk" xmlns:wne="http://schemas.microsoft.com/office/word/2006/wordml" xmlns:wps="http://schemas.microsoft.com/office/word/2010/wordprocessingShape" mc:Ignorable="w14 w15 w16se w16cid w16 w16cex w16sdtdh wp14">
   <w:endnote w:type="separator" w:id="-1">
     <w:p>
       <w:pPr>
@@ -4028,7 +3969,7 @@
 </file>
 
 <file path=word/footnotes.xml><?xml version="1.0" encoding="utf-8"?>
-<w:footnotes xmlns:wpc="http://schemas.microsoft.com/office/word/2010/wordprocessingCanvas" xmlns:cx="http://schemas.microsoft.com/office/drawing/2014/chartex" xmlns:cx1="http://schemas.microsoft.com/office/drawing/2015/9/8/chartex" xmlns:cx2="http://schemas.microsoft.com/office/drawing/2015/10/21/chartex" xmlns:cx3="http://schemas.microsoft.com/office/drawing/2016/5/9/chartex" xmlns:cx4="http://schemas.microsoft.com/office/drawing/2016/5/10/chartex" xmlns:cx5="http://schemas.microsoft.com/office/drawing/2016/5/11/chartex" xmlns:cx6="http://schemas.microsoft.com/office/drawing/2016/5/12/chartex" xmlns:cx7="http://schemas.microsoft.com/office/drawing/2016/5/13/chartex" xmlns:cx8="http://schemas.microsoft.com/office/drawing/2016/5/14/chartex" xmlns:mc="http://schemas.openxmlformats.org/markup-compatibility/2006" xmlns:aink="http://schemas.microsoft.com/office/drawing/2016/ink" xmlns:am3d="http://schemas.microsoft.com/office/drawing/2017/model3d" xmlns:o="urn:schemas-microsoft-com:office:office" xmlns:oel="http://schemas.microsoft.com/office/2019/extlst" xmlns:r="http://schemas.openxmlformats.org/officeDocument/2006/relationships" xmlns:m="http://schemas.openxmlformats.org/officeDocument/2006/math" xmlns:v="urn:schemas-microsoft-com:vml" xmlns:wp14="http://schemas.microsoft.com/office/word/2010/wordprocessingDrawing" xmlns:wp="http://schemas.openxmlformats.org/drawingml/2006/wordprocessingDrawing" xmlns:w10="urn:schemas-microsoft-com:office:word" xmlns:w="http://schemas.openxmlformats.org/wordprocessingml/2006/main" xmlns:w14="http://schemas.microsoft.com/office/word/2010/wordml" xmlns:w15="http://schemas.microsoft.com/office/word/2012/wordml" xmlns:w16cex="http://schemas.microsoft.com/office/word/2018/wordml/cex" xmlns:w16cid="http://schemas.microsoft.com/office/word/2016/wordml/cid" xmlns:w16="http://schemas.microsoft.com/office/word/2018/wordml" xmlns:w16du="http://schemas.microsoft.com/office/word/2023/wordml/word16du" xmlns:w16sdtdh="http://schemas.microsoft.com/office/word/2020/wordml/sdtdatahash" xmlns:w16sdtfl="http://schemas.microsoft.com/office/word/2024/wordml/sdtformatlock" xmlns:w16se="http://schemas.microsoft.com/office/word/2015/wordml/symex" xmlns:wpg="http://schemas.microsoft.com/office/word/2010/wordprocessingGroup" xmlns:wpi="http://schemas.microsoft.com/office/word/2010/wordprocessingInk" xmlns:wne="http://schemas.microsoft.com/office/word/2006/wordml" xmlns:wps="http://schemas.microsoft.com/office/word/2010/wordprocessingShape" mc:Ignorable="w14 w15 w16se w16cid w16 w16cex w16sdtdh w16sdtfl w16du wp14">
+<w:footnotes xmlns:wpc="http://schemas.microsoft.com/office/word/2010/wordprocessingCanvas" xmlns:cx="http://schemas.microsoft.com/office/drawing/2014/chartex" xmlns:cx1="http://schemas.microsoft.com/office/drawing/2015/9/8/chartex" xmlns:cx2="http://schemas.microsoft.com/office/drawing/2015/10/21/chartex" xmlns:cx3="http://schemas.microsoft.com/office/drawing/2016/5/9/chartex" xmlns:cx4="http://schemas.microsoft.com/office/drawing/2016/5/10/chartex" xmlns:cx5="http://schemas.microsoft.com/office/drawing/2016/5/11/chartex" xmlns:cx6="http://schemas.microsoft.com/office/drawing/2016/5/12/chartex" xmlns:cx7="http://schemas.microsoft.com/office/drawing/2016/5/13/chartex" xmlns:cx8="http://schemas.microsoft.com/office/drawing/2016/5/14/chartex" xmlns:mc="http://schemas.openxmlformats.org/markup-compatibility/2006" xmlns:aink="http://schemas.microsoft.com/office/drawing/2016/ink" xmlns:am3d="http://schemas.microsoft.com/office/drawing/2017/model3d" xmlns:o="urn:schemas-microsoft-com:office:office" xmlns:r="http://schemas.openxmlformats.org/officeDocument/2006/relationships" xmlns:m="http://schemas.openxmlformats.org/officeDocument/2006/math" xmlns:v="urn:schemas-microsoft-com:vml" xmlns:wp14="http://schemas.microsoft.com/office/word/2010/wordprocessingDrawing" xmlns:wp="http://schemas.openxmlformats.org/drawingml/2006/wordprocessingDrawing" xmlns:w10="urn:schemas-microsoft-com:office:word" xmlns:w="http://schemas.openxmlformats.org/wordprocessingml/2006/main" xmlns:w14="http://schemas.microsoft.com/office/word/2010/wordml" xmlns:w15="http://schemas.microsoft.com/office/word/2012/wordml" xmlns:w16cex="http://schemas.microsoft.com/office/word/2018/wordml/cex" xmlns:w16cid="http://schemas.microsoft.com/office/word/2016/wordml/cid" xmlns:w16="http://schemas.microsoft.com/office/word/2018/wordml" xmlns:w16sdtdh="http://schemas.microsoft.com/office/word/2020/wordml/sdtdatahash" xmlns:w16se="http://schemas.microsoft.com/office/word/2015/wordml/symex" xmlns:wpg="http://schemas.microsoft.com/office/word/2010/wordprocessingGroup" xmlns:wpi="http://schemas.microsoft.com/office/word/2010/wordprocessingInk" xmlns:wne="http://schemas.microsoft.com/office/word/2006/wordml" xmlns:wps="http://schemas.microsoft.com/office/word/2010/wordprocessingShape" mc:Ignorable="w14 w15 w16se w16cid w16 w16cex w16sdtdh wp14">
   <w:footnote w:type="separator" w:id="-1">
     <w:p>
       <w:pPr>
@@ -4053,7 +3994,7 @@
 </file>
 
 <file path=word/header1.xml><?xml version="1.0" encoding="utf-8"?>
-<w:hdr xmlns:wpc="http://schemas.microsoft.com/office/word/2010/wordprocessingCanvas" xmlns:cx="http://schemas.microsoft.com/office/drawing/2014/chartex" xmlns:cx1="http://schemas.microsoft.com/office/drawing/2015/9/8/chartex" xmlns:cx2="http://schemas.microsoft.com/office/drawing/2015/10/21/chartex" xmlns:cx3="http://schemas.microsoft.com/office/drawing/2016/5/9/chartex" xmlns:cx4="http://schemas.microsoft.com/office/drawing/2016/5/10/chartex" xmlns:cx5="http://schemas.microsoft.com/office/drawing/2016/5/11/chartex" xmlns:cx6="http://schemas.microsoft.com/office/drawing/2016/5/12/chartex" xmlns:cx7="http://schemas.microsoft.com/office/drawing/2016/5/13/chartex" xmlns:cx8="http://schemas.microsoft.com/office/drawing/2016/5/14/chartex" xmlns:mc="http://schemas.openxmlformats.org/markup-compatibility/2006" xmlns:aink="http://schemas.microsoft.com/office/drawing/2016/ink" xmlns:am3d="http://schemas.microsoft.com/office/drawing/2017/model3d" xmlns:o="urn:schemas-microsoft-com:office:office" xmlns:oel="http://schemas.microsoft.com/office/2019/extlst" xmlns:r="http://schemas.openxmlformats.org/officeDocument/2006/relationships" xmlns:m="http://schemas.openxmlformats.org/officeDocument/2006/math" xmlns:v="urn:schemas-microsoft-com:vml" xmlns:wp14="http://schemas.microsoft.com/office/word/2010/wordprocessingDrawing" xmlns:wp="http://schemas.openxmlformats.org/drawingml/2006/wordprocessingDrawing" xmlns:w10="urn:schemas-microsoft-com:office:word" xmlns:w="http://schemas.openxmlformats.org/wordprocessingml/2006/main" xmlns:w14="http://schemas.microsoft.com/office/word/2010/wordml" xmlns:w15="http://schemas.microsoft.com/office/word/2012/wordml" xmlns:w16cex="http://schemas.microsoft.com/office/word/2018/wordml/cex" xmlns:w16cid="http://schemas.microsoft.com/office/word/2016/wordml/cid" xmlns:w16="http://schemas.microsoft.com/office/word/2018/wordml" xmlns:w16du="http://schemas.microsoft.com/office/word/2023/wordml/word16du" xmlns:w16sdtdh="http://schemas.microsoft.com/office/word/2020/wordml/sdtdatahash" xmlns:w16sdtfl="http://schemas.microsoft.com/office/word/2024/wordml/sdtformatlock" xmlns:w16se="http://schemas.microsoft.com/office/word/2015/wordml/symex" xmlns:wpg="http://schemas.microsoft.com/office/word/2010/wordprocessingGroup" xmlns:wpi="http://schemas.microsoft.com/office/word/2010/wordprocessingInk" xmlns:wne="http://schemas.microsoft.com/office/word/2006/wordml" xmlns:wps="http://schemas.microsoft.com/office/word/2010/wordprocessingShape" mc:Ignorable="w14 w15 w16se w16cid w16 w16cex w16sdtdh w16sdtfl w16du wp14">
+<w:hdr xmlns:wpc="http://schemas.microsoft.com/office/word/2010/wordprocessingCanvas" xmlns:cx="http://schemas.microsoft.com/office/drawing/2014/chartex" xmlns:cx1="http://schemas.microsoft.com/office/drawing/2015/9/8/chartex" xmlns:cx2="http://schemas.microsoft.com/office/drawing/2015/10/21/chartex" xmlns:cx3="http://schemas.microsoft.com/office/drawing/2016/5/9/chartex" xmlns:cx4="http://schemas.microsoft.com/office/drawing/2016/5/10/chartex" xmlns:cx5="http://schemas.microsoft.com/office/drawing/2016/5/11/chartex" xmlns:cx6="http://schemas.microsoft.com/office/drawing/2016/5/12/chartex" xmlns:cx7="http://schemas.microsoft.com/office/drawing/2016/5/13/chartex" xmlns:cx8="http://schemas.microsoft.com/office/drawing/2016/5/14/chartex" xmlns:mc="http://schemas.openxmlformats.org/markup-compatibility/2006" xmlns:aink="http://schemas.microsoft.com/office/drawing/2016/ink" xmlns:am3d="http://schemas.microsoft.com/office/drawing/2017/model3d" xmlns:o="urn:schemas-microsoft-com:office:office" xmlns:r="http://schemas.openxmlformats.org/officeDocument/2006/relationships" xmlns:m="http://schemas.openxmlformats.org/officeDocument/2006/math" xmlns:v="urn:schemas-microsoft-com:vml" xmlns:wp14="http://schemas.microsoft.com/office/word/2010/wordprocessingDrawing" xmlns:wp="http://schemas.openxmlformats.org/drawingml/2006/wordprocessingDrawing" xmlns:w10="urn:schemas-microsoft-com:office:word" xmlns:w="http://schemas.openxmlformats.org/wordprocessingml/2006/main" xmlns:w14="http://schemas.microsoft.com/office/word/2010/wordml" xmlns:w15="http://schemas.microsoft.com/office/word/2012/wordml" xmlns:w16cex="http://schemas.microsoft.com/office/word/2018/wordml/cex" xmlns:w16cid="http://schemas.microsoft.com/office/word/2016/wordml/cid" xmlns:w16="http://schemas.microsoft.com/office/word/2018/wordml" xmlns:w16sdtdh="http://schemas.microsoft.com/office/word/2020/wordml/sdtdatahash" xmlns:w16se="http://schemas.microsoft.com/office/word/2015/wordml/symex" xmlns:wpg="http://schemas.microsoft.com/office/word/2010/wordprocessingGroup" xmlns:wpi="http://schemas.microsoft.com/office/word/2010/wordprocessingInk" xmlns:wne="http://schemas.microsoft.com/office/word/2006/wordml" xmlns:wps="http://schemas.microsoft.com/office/word/2010/wordprocessingShape" mc:Ignorable="w14 w15 w16se w16cid w16 w16cex w16sdtdh wp14">
   <w:p>
     <w:pPr>
       <w:spacing w:after="0" w:line="240" w:lineRule="auto"/>
@@ -4196,7 +4137,7 @@
 </file>
 
 <file path=word/numbering.xml><?xml version="1.0" encoding="utf-8"?>
-<w:numbering xmlns:wpc="http://schemas.microsoft.com/office/word/2010/wordprocessingCanvas" xmlns:cx="http://schemas.microsoft.com/office/drawing/2014/chartex" xmlns:cx1="http://schemas.microsoft.com/office/drawing/2015/9/8/chartex" xmlns:cx2="http://schemas.microsoft.com/office/drawing/2015/10/21/chartex" xmlns:cx3="http://schemas.microsoft.com/office/drawing/2016/5/9/chartex" xmlns:cx4="http://schemas.microsoft.com/office/drawing/2016/5/10/chartex" xmlns:cx5="http://schemas.microsoft.com/office/drawing/2016/5/11/chartex" xmlns:cx6="http://schemas.microsoft.com/office/drawing/2016/5/12/chartex" xmlns:cx7="http://schemas.microsoft.com/office/drawing/2016/5/13/chartex" xmlns:cx8="http://schemas.microsoft.com/office/drawing/2016/5/14/chartex" xmlns:mc="http://schemas.openxmlformats.org/markup-compatibility/2006" xmlns:aink="http://schemas.microsoft.com/office/drawing/2016/ink" xmlns:am3d="http://schemas.microsoft.com/office/drawing/2017/model3d" xmlns:o="urn:schemas-microsoft-com:office:office" xmlns:oel="http://schemas.microsoft.com/office/2019/extlst" xmlns:r="http://schemas.openxmlformats.org/officeDocument/2006/relationships" xmlns:m="http://schemas.openxmlformats.org/officeDocument/2006/math" xmlns:v="urn:schemas-microsoft-com:vml" xmlns:wp14="http://schemas.microsoft.com/office/word/2010/wordprocessingDrawing" xmlns:wp="http://schemas.openxmlformats.org/drawingml/2006/wordprocessingDrawing" xmlns:w10="urn:schemas-microsoft-com:office:word" xmlns:w="http://schemas.openxmlformats.org/wordprocessingml/2006/main" xmlns:w14="http://schemas.microsoft.com/office/word/2010/wordml" xmlns:w15="http://schemas.microsoft.com/office/word/2012/wordml" xmlns:w16cex="http://schemas.microsoft.com/office/word/2018/wordml/cex" xmlns:w16cid="http://schemas.microsoft.com/office/word/2016/wordml/cid" xmlns:w16="http://schemas.microsoft.com/office/word/2018/wordml" xmlns:w16du="http://schemas.microsoft.com/office/word/2023/wordml/word16du" xmlns:w16sdtdh="http://schemas.microsoft.com/office/word/2020/wordml/sdtdatahash" xmlns:w16sdtfl="http://schemas.microsoft.com/office/word/2024/wordml/sdtformatlock" xmlns:w16se="http://schemas.microsoft.com/office/word/2015/wordml/symex" xmlns:wpg="http://schemas.microsoft.com/office/word/2010/wordprocessingGroup" xmlns:wpi="http://schemas.microsoft.com/office/word/2010/wordprocessingInk" xmlns:wne="http://schemas.microsoft.com/office/word/2006/wordml" xmlns:wps="http://schemas.microsoft.com/office/word/2010/wordprocessingShape" mc:Ignorable="w14 w15 w16se w16cid w16 w16cex w16sdtdh w16sdtfl w16du wp14">
+<w:numbering xmlns:wpc="http://schemas.microsoft.com/office/word/2010/wordprocessingCanvas" xmlns:cx="http://schemas.microsoft.com/office/drawing/2014/chartex" xmlns:cx1="http://schemas.microsoft.com/office/drawing/2015/9/8/chartex" xmlns:cx2="http://schemas.microsoft.com/office/drawing/2015/10/21/chartex" xmlns:cx3="http://schemas.microsoft.com/office/drawing/2016/5/9/chartex" xmlns:cx4="http://schemas.microsoft.com/office/drawing/2016/5/10/chartex" xmlns:cx5="http://schemas.microsoft.com/office/drawing/2016/5/11/chartex" xmlns:cx6="http://schemas.microsoft.com/office/drawing/2016/5/12/chartex" xmlns:cx7="http://schemas.microsoft.com/office/drawing/2016/5/13/chartex" xmlns:cx8="http://schemas.microsoft.com/office/drawing/2016/5/14/chartex" xmlns:mc="http://schemas.openxmlformats.org/markup-compatibility/2006" xmlns:aink="http://schemas.microsoft.com/office/drawing/2016/ink" xmlns:am3d="http://schemas.microsoft.com/office/drawing/2017/model3d" xmlns:o="urn:schemas-microsoft-com:office:office" xmlns:r="http://schemas.openxmlformats.org/officeDocument/2006/relationships" xmlns:m="http://schemas.openxmlformats.org/officeDocument/2006/math" xmlns:v="urn:schemas-microsoft-com:vml" xmlns:wp14="http://schemas.microsoft.com/office/word/2010/wordprocessingDrawing" xmlns:wp="http://schemas.openxmlformats.org/drawingml/2006/wordprocessingDrawing" xmlns:w10="urn:schemas-microsoft-com:office:word" xmlns:w="http://schemas.openxmlformats.org/wordprocessingml/2006/main" xmlns:w14="http://schemas.microsoft.com/office/word/2010/wordml" xmlns:w15="http://schemas.microsoft.com/office/word/2012/wordml" xmlns:w16cex="http://schemas.microsoft.com/office/word/2018/wordml/cex" xmlns:w16cid="http://schemas.microsoft.com/office/word/2016/wordml/cid" xmlns:w16="http://schemas.microsoft.com/office/word/2018/wordml" xmlns:w16sdtdh="http://schemas.microsoft.com/office/word/2020/wordml/sdtdatahash" xmlns:w16se="http://schemas.microsoft.com/office/word/2015/wordml/symex" xmlns:wpg="http://schemas.microsoft.com/office/word/2010/wordprocessingGroup" xmlns:wpi="http://schemas.microsoft.com/office/word/2010/wordprocessingInk" xmlns:wne="http://schemas.microsoft.com/office/word/2006/wordml" xmlns:wps="http://schemas.microsoft.com/office/word/2010/wordprocessingShape" mc:Ignorable="w14 w15 w16se w16cid w16 w16cex w16sdtdh wp14">
   <w:abstractNum w:abstractNumId="0" w15:restartNumberingAfterBreak="0">
     <w:nsid w:val="0FF85A8C"/>
     <w:multiLevelType w:val="hybridMultilevel"/>
@@ -5862,53 +5803,53 @@
       </w:pPr>
     </w:lvl>
   </w:abstractNum>
-  <w:num w:numId="1" w16cid:durableId="1464345646">
+  <w:num w:numId="1">
     <w:abstractNumId w:val="1"/>
   </w:num>
-  <w:num w:numId="2" w16cid:durableId="1348755695">
+  <w:num w:numId="2">
     <w:abstractNumId w:val="3"/>
   </w:num>
-  <w:num w:numId="3" w16cid:durableId="599216494">
+  <w:num w:numId="3">
     <w:abstractNumId w:val="12"/>
   </w:num>
-  <w:num w:numId="4" w16cid:durableId="808673154">
+  <w:num w:numId="4">
     <w:abstractNumId w:val="4"/>
   </w:num>
-  <w:num w:numId="5" w16cid:durableId="385186429">
+  <w:num w:numId="5">
     <w:abstractNumId w:val="8"/>
   </w:num>
-  <w:num w:numId="6" w16cid:durableId="32460784">
+  <w:num w:numId="6">
     <w:abstractNumId w:val="7"/>
   </w:num>
-  <w:num w:numId="7" w16cid:durableId="1818912224">
+  <w:num w:numId="7">
     <w:abstractNumId w:val="10"/>
   </w:num>
-  <w:num w:numId="8" w16cid:durableId="996492363">
+  <w:num w:numId="8">
     <w:abstractNumId w:val="6"/>
   </w:num>
-  <w:num w:numId="9" w16cid:durableId="582027270">
+  <w:num w:numId="9">
     <w:abstractNumId w:val="2"/>
   </w:num>
-  <w:num w:numId="10" w16cid:durableId="1888838204">
+  <w:num w:numId="10">
     <w:abstractNumId w:val="11"/>
   </w:num>
-  <w:num w:numId="11" w16cid:durableId="711270914">
+  <w:num w:numId="11">
     <w:abstractNumId w:val="5"/>
   </w:num>
-  <w:num w:numId="12" w16cid:durableId="1972517053">
+  <w:num w:numId="12">
     <w:abstractNumId w:val="9"/>
   </w:num>
-  <w:num w:numId="13" w16cid:durableId="737944378">
+  <w:num w:numId="13">
     <w:abstractNumId w:val="0"/>
   </w:num>
-  <w:num w:numId="14" w16cid:durableId="185944872">
+  <w:num w:numId="14">
     <w:abstractNumId w:val="13"/>
   </w:num>
 </w:numbering>
 </file>
 
 <file path=word/styles.xml><?xml version="1.0" encoding="utf-8"?>
-<w:styles xmlns:mc="http://schemas.openxmlformats.org/markup-compatibility/2006" xmlns:r="http://schemas.openxmlformats.org/officeDocument/2006/relationships" xmlns:w="http://schemas.openxmlformats.org/wordprocessingml/2006/main" xmlns:w14="http://schemas.microsoft.com/office/word/2010/wordml" xmlns:w15="http://schemas.microsoft.com/office/word/2012/wordml" xmlns:w16cex="http://schemas.microsoft.com/office/word/2018/wordml/cex" xmlns:w16cid="http://schemas.microsoft.com/office/word/2016/wordml/cid" xmlns:w16="http://schemas.microsoft.com/office/word/2018/wordml" xmlns:w16du="http://schemas.microsoft.com/office/word/2023/wordml/word16du" xmlns:w16sdtdh="http://schemas.microsoft.com/office/word/2020/wordml/sdtdatahash" xmlns:w16sdtfl="http://schemas.microsoft.com/office/word/2024/wordml/sdtformatlock" xmlns:w16se="http://schemas.microsoft.com/office/word/2015/wordml/symex" mc:Ignorable="w14 w15 w16se w16cid w16 w16cex w16sdtdh w16sdtfl w16du">
+<w:styles xmlns:mc="http://schemas.openxmlformats.org/markup-compatibility/2006" xmlns:r="http://schemas.openxmlformats.org/officeDocument/2006/relationships" xmlns:w="http://schemas.openxmlformats.org/wordprocessingml/2006/main" xmlns:w14="http://schemas.microsoft.com/office/word/2010/wordml" xmlns:w15="http://schemas.microsoft.com/office/word/2012/wordml" xmlns:w16cex="http://schemas.microsoft.com/office/word/2018/wordml/cex" xmlns:w16cid="http://schemas.microsoft.com/office/word/2016/wordml/cid" xmlns:w16="http://schemas.microsoft.com/office/word/2018/wordml" xmlns:w16sdtdh="http://schemas.microsoft.com/office/word/2020/wordml/sdtdatahash" xmlns:w16se="http://schemas.microsoft.com/office/word/2015/wordml/symex" mc:Ignorable="w14 w15 w16se w16cid w16 w16cex w16sdtdh">
   <w:docDefaults>
     <w:rPrDefault>
       <w:rPr>

</xml_diff>